<commit_message>
ATS improvements: LinkedIn full URL, +Bootstrap/AJAX/Docker, fix duplicate labels, revert inaccurate JWT claim
</commit_message>
<xml_diff>
--- a/SURAJ_DOBALE_RESUME.docx
+++ b/SURAJ_DOBALE_RESUME.docx
@@ -67,45 +67,51 @@
       <w:hyperlink r:id="rId10">
         <w:r>
           <w:rPr>
+            <w:rStyle w:val="Hyperlink"/>
+            <w:sz w:val="20"/>
+            <w:rFonts w:ascii="Calibri" w:hAnsi="Calibri"/>
             <w:color w:val="0563C1"/>
             <w:u w:val="single"/>
-            <w:sz w:val="18"/>
           </w:rPr>
-          <w:t>LinkedIn</w:t>
+          <w:t>linkedin.com/in/suraj-dobale-b713b91a6</w:t>
         </w:r>
       </w:hyperlink>
       <w:r>
         <w:rPr>
+          <w:sz w:val="20"/>
           <w:rFonts w:ascii="Calibri" w:hAnsi="Calibri"/>
-          <w:sz w:val="18"/>
         </w:rPr>
         <w:t xml:space="preserve">  |  </w:t>
       </w:r>
       <w:hyperlink r:id="rId11">
         <w:r>
           <w:rPr>
+            <w:rStyle w:val="Hyperlink"/>
+            <w:sz w:val="20"/>
+            <w:rFonts w:ascii="Calibri" w:hAnsi="Calibri"/>
             <w:color w:val="0563C1"/>
             <w:u w:val="single"/>
-            <w:sz w:val="18"/>
           </w:rPr>
-          <w:t>GitHub</w:t>
+          <w:t>github.com/SURYaDob</w:t>
         </w:r>
       </w:hyperlink>
       <w:r>
         <w:rPr>
+          <w:sz w:val="20"/>
           <w:rFonts w:ascii="Calibri" w:hAnsi="Calibri"/>
-          <w:sz w:val="18"/>
         </w:rPr>
         <w:t xml:space="preserve">  |  </w:t>
       </w:r>
       <w:hyperlink r:id="rId12">
         <w:r>
           <w:rPr>
+            <w:rStyle w:val="Hyperlink"/>
+            <w:sz w:val="20"/>
+            <w:rFonts w:ascii="Calibri" w:hAnsi="Calibri"/>
             <w:color w:val="0563C1"/>
             <w:u w:val="single"/>
-            <w:sz w:val="18"/>
           </w:rPr>
-          <w:t>Portfolio</w:t>
+          <w:t>suryadob.github.io/resume-portfolio/</w:t>
         </w:r>
       </w:hyperlink>
     </w:p>
@@ -318,14 +324,13 @@
           <w:b/>
           <w:sz w:val="22"/>
         </w:rPr>
-        <w:t xml:space="preserve">Frontend: </w:t>
       </w:r>
       <w:r>
         <w:rPr>
           <w:rFonts w:ascii="Calibri" w:hAnsi="Calibri"/>
           <w:sz w:val="22"/>
         </w:rPr>
-        <w:t>HTML5, CSS3, JavaScript, Thymeleaf, Responsive Design, JSON</w:t>
+        <w:t>Frontend: HTML5, CSS3, JavaScript, Bootstrap, Thymeleaf, AJAX, Responsive Design, JSON</w:t>
       </w:r>
     </w:p>
     <w:p>
@@ -358,14 +363,13 @@
           <w:b/>
           <w:sz w:val="22"/>
         </w:rPr>
-        <w:t xml:space="preserve">Tools &amp; Platforms: </w:t>
       </w:r>
       <w:r>
         <w:rPr>
           <w:rFonts w:ascii="Calibri" w:hAnsi="Calibri"/>
           <w:sz w:val="22"/>
         </w:rPr>
-        <w:t>Git, GitHub, Maven, Postman, Eclipse, VS Code, Linux, Windows, Render</w:t>
+        <w:t>Tools &amp; Platforms: Git, GitHub, Maven, Docker, Postman, Eclipse, VS Code, Linux, Windows, Render</w:t>
       </w:r>
     </w:p>
     <w:p>
@@ -522,7 +526,7 @@
           <w:rFonts w:ascii="Calibri" w:hAnsi="Calibri"/>
           <w:sz w:val="22"/>
         </w:rPr>
-        <w:t>Full-stack task management app with user registration, login, and role-based access. Users can create, update, and organize tasks and projects — with MySQL persistence via JPA repositories. Integrated Spring Security for authentication and authorization. Deployed on Render.</w:t>
+        <w:t>Full-stack task management app with user registration, login, and role-based access. Users can create, update, and organize tasks and projects — with MySQL persistence via JPA repositories. Integrated Spring Security for authentication and role-based authorization. Deployed on Render.</w:t>
       </w:r>
     </w:p>
     <w:p>

</xml_diff>